<commit_message>
Add James Hodges Sr. to patriarch page footnote
- Added reference to prominent early settler James Hodges Sr. (1775-1846)
- Potential connection to Hodges family tree

🤖 Generated with [Claude Code](https://claude.com/claude-code)

Co-Authored-By: Claude <noreply@anthropic.com>
</commit_message>
<xml_diff>
--- a/Hodges_docs/Hodges Dickinson connection.docx
+++ b/Hodges_docs/Hodges Dickinson connection.docx
@@ -60,7 +60,7 @@
         </w:rPr>
         <w:lastRenderedPageBreak/>
         <w:drawing>
-          <wp:inline distT="0" distB="0" distL="0" distR="0" wp14:anchorId="3B722F2E" wp14:editId="4E8782F8">
+          <wp:inline distT="0" distB="0" distL="0" distR="0" wp14:anchorId="3B722F2E" wp14:editId="3151155A">
             <wp:extent cx="5943600" cy="4981575"/>
             <wp:effectExtent l="0" t="0" r="0" b="0"/>
             <wp:docPr id="56744123" name="Picture 4" descr="A screenshot of a black and white text&#10;&#10;AI-generated content may be incorrect."/>
@@ -138,55 +138,7 @@
       </w:r>
     </w:p>
     <w:p/>
-    <w:p>
-      <w:r>
-        <w:rPr>
-          <w:noProof/>
-        </w:rPr>
-        <w:lastRenderedPageBreak/>
-        <w:drawing>
-          <wp:inline distT="0" distB="0" distL="0" distR="0" wp14:anchorId="10C68F25" wp14:editId="35CB0CB6">
-            <wp:extent cx="5943600" cy="5112385"/>
-            <wp:effectExtent l="0" t="0" r="0" b="5715"/>
-            <wp:docPr id="62353791" name="Picture 5" descr="A screenshot of a black and white text&#10;&#10;AI-generated content may be incorrect."/>
-            <wp:cNvGraphicFramePr>
-              <a:graphicFrameLocks xmlns:a="http://schemas.openxmlformats.org/drawingml/2006/main" noChangeAspect="1"/>
-            </wp:cNvGraphicFramePr>
-            <a:graphic xmlns:a="http://schemas.openxmlformats.org/drawingml/2006/main">
-              <a:graphicData uri="http://schemas.openxmlformats.org/drawingml/2006/picture">
-                <pic:pic xmlns:pic="http://schemas.openxmlformats.org/drawingml/2006/picture">
-                  <pic:nvPicPr>
-                    <pic:cNvPr id="62353791" name="Picture 5" descr="A screenshot of a black and white text&#10;&#10;AI-generated content may be incorrect."/>
-                    <pic:cNvPicPr/>
-                  </pic:nvPicPr>
-                  <pic:blipFill>
-                    <a:blip r:embed="rId7">
-                      <a:extLst>
-                        <a:ext uri="{28A0092B-C50C-407E-A947-70E740481C1C}">
-                          <a14:useLocalDpi xmlns:a14="http://schemas.microsoft.com/office/drawing/2010/main" val="0"/>
-                        </a:ext>
-                      </a:extLst>
-                    </a:blip>
-                    <a:stretch>
-                      <a:fillRect/>
-                    </a:stretch>
-                  </pic:blipFill>
-                  <pic:spPr>
-                    <a:xfrm>
-                      <a:off x="0" y="0"/>
-                      <a:ext cx="5943600" cy="5112385"/>
-                    </a:xfrm>
-                    <a:prstGeom prst="rect">
-                      <a:avLst/>
-                    </a:prstGeom>
-                  </pic:spPr>
-                </pic:pic>
-              </a:graphicData>
-            </a:graphic>
-          </wp:inline>
-        </w:drawing>
-      </w:r>
-    </w:p>
+    <w:p/>
     <w:p/>
     <w:p/>
     <w:p/>
@@ -210,7 +162,6 @@
         <w:rPr>
           <w:noProof/>
         </w:rPr>
-        <w:lastRenderedPageBreak/>
         <w:drawing>
           <wp:inline distT="0" distB="0" distL="0" distR="0" wp14:anchorId="360906CA" wp14:editId="2E4AF2AB">
             <wp:extent cx="5943600" cy="1497965"/>
@@ -227,7 +178,7 @@
                     <pic:cNvPicPr/>
                   </pic:nvPicPr>
                   <pic:blipFill>
-                    <a:blip r:embed="rId8" cstate="print">
+                    <a:blip r:embed="rId7" cstate="print">
                       <a:extLst>
                         <a:ext uri="{28A0092B-C50C-407E-A947-70E740481C1C}">
                           <a14:useLocalDpi xmlns:a14="http://schemas.microsoft.com/office/drawing/2010/main" val="0"/>
@@ -275,7 +226,7 @@
                     <pic:cNvPicPr/>
                   </pic:nvPicPr>
                   <pic:blipFill>
-                    <a:blip r:embed="rId9" cstate="print">
+                    <a:blip r:embed="rId8" cstate="print">
                       <a:extLst>
                         <a:ext uri="{28A0092B-C50C-407E-A947-70E740481C1C}">
                           <a14:useLocalDpi xmlns:a14="http://schemas.microsoft.com/office/drawing/2010/main" val="0"/>
@@ -306,7 +257,7 @@
           <w:noProof/>
         </w:rPr>
         <w:drawing>
-          <wp:inline distT="0" distB="0" distL="0" distR="0" wp14:anchorId="5FC81C5C" wp14:editId="448F74FA">
+          <wp:inline distT="0" distB="0" distL="0" distR="0" wp14:anchorId="5FC81C5C" wp14:editId="11CAEF75">
             <wp:extent cx="5943600" cy="1446530"/>
             <wp:effectExtent l="0" t="0" r="0" b="1270"/>
             <wp:docPr id="2032327362" name="Picture 6" descr="A close-up of a computer screen&#10;&#10;AI-generated content may be incorrect."/>
@@ -321,7 +272,7 @@
                     <pic:cNvPicPr/>
                   </pic:nvPicPr>
                   <pic:blipFill>
-                    <a:blip r:embed="rId10" cstate="print">
+                    <a:blip r:embed="rId9" cstate="print">
                       <a:extLst>
                         <a:ext uri="{28A0092B-C50C-407E-A947-70E740481C1C}">
                           <a14:useLocalDpi xmlns:a14="http://schemas.microsoft.com/office/drawing/2010/main" val="0"/>
@@ -371,7 +322,7 @@
       </w:r>
     </w:p>
     <w:p>
-      <w:hyperlink r:id="rId11" w:history="1">
+      <w:hyperlink r:id="rId10" w:history="1">
         <w:r>
           <w:rPr>
             <w:rStyle w:val="Hyperlink"/>
@@ -381,7 +332,7 @@
       </w:hyperlink>
     </w:p>
     <w:p>
-      <w:hyperlink r:id="rId12" w:history="1">
+      <w:hyperlink r:id="rId11" w:history="1">
         <w:r>
           <w:rPr>
             <w:rStyle w:val="Hyperlink"/>

</xml_diff>